<commit_message>
feat(proposal): combo WORK shows the real picked epoxy system name
Combo's 'Option 1: Epoxy System' was generic. It now reads the actual System 1
buildup (Epoxy!A22), e.g. 'Option 1: MACRO Flake Single Broadcast', via a new
{{epoxy_system_name}} token backfilled from cell_values (fallback: 'Epoxy
System'). Option 2 (Polished Concrete) unchanged.

Co-Authored-By: Claude Opus 4.8 (1M context) <noreply@anthropic.com>
</commit_message>
<xml_diff>
--- a/backend/templates/Direct/xx.xx.xx TREADWELL COMBO PROPOSAL - CUSTMOER NAME.docx
+++ b/backend/templates/Direct/xx.xx.xx TREADWELL COMBO PROPOSAL - CUSTMOER NAME.docx
@@ -959,7 +959,7 @@
                                 <w:sz w:val="18"/>
                                 <w:szCs w:val="18"/>
                               </w:rPr>
-                              <w:t xml:space="preserve">Epoxy System </w:t>
+                              <w:t xml:space="preserve">{{epoxy_system_name}} </w:t>
                             </w:r>
                           </w:p>
                           <w:p>
@@ -1490,7 +1490,7 @@
                           <w:sz w:val="18"/>
                           <w:szCs w:val="18"/>
                         </w:rPr>
-                        <w:t xml:space="preserve">Epoxy System </w:t>
+                        <w:t xml:space="preserve">{{epoxy_system_name}} </w:t>
                       </w:r>
                     </w:p>
                     <w:p>

</xml_diff>

<commit_message>
feat: add combo WORK Notes template docx (was parked in stash during prod-promo)
Co-Authored-By: Claude Opus 4.8 (1M context) <noreply@anthropic.com>
</commit_message>
<xml_diff>
--- a/backend/templates/Direct/xx.xx.xx TREADWELL COMBO PROPOSAL - CUSTMOER NAME.docx
+++ b/backend/templates/Direct/xx.xx.xx TREADWELL COMBO PROPOSAL - CUSTMOER NAME.docx
@@ -1292,6 +1292,89 @@
                           </w:p>
                           <w:p>
                             <w:pPr>
+                              <w:pStyle w:val="ListParagraph"/>
+                              <w:numPr>
+                                <w:ilvl w:val="0"/>
+                                <w:numId w:val="4"/>
+                              </w:numPr>
+                              <w:tabs>
+                                <w:tab w:val="left" w:pos="1080"/>
+                              </w:tabs>
+                              <w:spacing w:line="300" w:lineRule="auto"/>
+                              <w:rPr>
+                                <w:rFonts w:ascii="Zetta Serif Book" w:hAnsi="Zetta Serif Book"/>
+                                <w:color w:val="404040" w:themeColor="text1" w:themeTint="BF"/>
+                                <w:sz w:val="18"/>
+                                <w:szCs w:val="18"/>
+                              </w:rPr>
+                            </w:pPr>
+                            <w:r>
+                              <w:rPr>
+                                <w:rFonts w:ascii="Zetta Serif Book" w:hAnsi="Zetta Serif Book"/>
+                                <w:b/>
+                                <w:color w:val="404040" w:themeColor="text1" w:themeTint="BF"/>
+                                <w:sz w:val="18"/>
+                                <w:szCs w:val="18"/>
+                              </w:rPr>
+                              <w:t>Notes:</w:t>
+                            </w:r>
+                            <w:r>
+                              <w:rPr>
+                                <w:rFonts w:ascii="Zetta Serif Book" w:hAnsi="Zetta Serif Book"/>
+                                <w:color w:val="404040" w:themeColor="text1" w:themeTint="BF"/>
+                                <w:sz w:val="18"/>
+                                <w:szCs w:val="18"/>
+                              </w:rPr>
+                              <w:t xml:space="preserve">  {{work_notes}}</w:t>
+                            </w:r>
+                            <w:r>
+                              <w:rPr>
+                                <w:rFonts w:ascii="Zetta Serif Book" w:hAnsi="Zetta Serif Book"/>
+                                <w:color w:val="404040" w:themeColor="text1" w:themeTint="BF"/>
+                                <w:sz w:val="18"/>
+                                <w:szCs w:val="18"/>
+                              </w:rPr>
+                              <w:t xml:space="preserve"/>
+                            </w:r>
+                            <w:r>
+                              <w:rPr>
+                                <w:rFonts w:ascii="Zetta Serif Book" w:hAnsi="Zetta Serif Book"/>
+                                <w:color w:val="404040" w:themeColor="text1" w:themeTint="BF"/>
+                                <w:sz w:val="18"/>
+                                <w:szCs w:val="18"/>
+                              </w:rPr>
+                              <w:t/>
+                            </w:r>
+                            <w:r>
+                              <w:rPr>
+                                <w:rFonts w:ascii="Zetta Serif Book" w:hAnsi="Zetta Serif Book"/>
+                                <w:color w:val="404040" w:themeColor="text1" w:themeTint="BF"/>
+                                <w:sz w:val="16"/>
+                                <w:szCs w:val="16"/>
+                              </w:rPr>
+                              <w:t/>
+                            </w:r>
+                            <w:r>
+                              <w:rPr>
+                                <w:rFonts w:ascii="Zetta Serif Book" w:hAnsi="Zetta Serif Book"/>
+                                <w:color w:val="404040" w:themeColor="text1" w:themeTint="BF"/>
+                                <w:sz w:val="16"/>
+                                <w:szCs w:val="16"/>
+                              </w:rPr>
+                              <w:t xml:space="preserve"/>
+                            </w:r>
+                            <w:r>
+                              <w:rPr>
+                                <w:rFonts w:ascii="Zetta Serif Book" w:hAnsi="Zetta Serif Book"/>
+                                <w:color w:val="404040" w:themeColor="text1" w:themeTint="BF"/>
+                                <w:sz w:val="18"/>
+                                <w:szCs w:val="18"/>
+                              </w:rPr>
+                              <w:t/>
+                            </w:r>
+                          </w:p>
+                          <w:p>
+                            <w:pPr>
                               <w:tabs>
                                 <w:tab w:val="left" w:pos="1080"/>
                               </w:tabs>
@@ -1785,6 +1868,89 @@
                           <w:szCs w:val="18"/>
                         </w:rPr>
                         <w:t xml:space="preserve">  {{exclusions}}</w:t>
+                      </w:r>
+                      <w:r>
+                        <w:rPr>
+                          <w:rFonts w:ascii="Zetta Serif Book" w:hAnsi="Zetta Serif Book"/>
+                          <w:color w:val="404040" w:themeColor="text1" w:themeTint="BF"/>
+                          <w:sz w:val="18"/>
+                          <w:szCs w:val="18"/>
+                        </w:rPr>
+                        <w:t xml:space="preserve"/>
+                      </w:r>
+                      <w:r>
+                        <w:rPr>
+                          <w:rFonts w:ascii="Zetta Serif Book" w:hAnsi="Zetta Serif Book"/>
+                          <w:color w:val="404040" w:themeColor="text1" w:themeTint="BF"/>
+                          <w:sz w:val="18"/>
+                          <w:szCs w:val="18"/>
+                        </w:rPr>
+                        <w:t/>
+                      </w:r>
+                      <w:r>
+                        <w:rPr>
+                          <w:rFonts w:ascii="Zetta Serif Book" w:hAnsi="Zetta Serif Book"/>
+                          <w:color w:val="404040" w:themeColor="text1" w:themeTint="BF"/>
+                          <w:sz w:val="16"/>
+                          <w:szCs w:val="16"/>
+                        </w:rPr>
+                        <w:t/>
+                      </w:r>
+                      <w:r>
+                        <w:rPr>
+                          <w:rFonts w:ascii="Zetta Serif Book" w:hAnsi="Zetta Serif Book"/>
+                          <w:color w:val="404040" w:themeColor="text1" w:themeTint="BF"/>
+                          <w:sz w:val="16"/>
+                          <w:szCs w:val="16"/>
+                        </w:rPr>
+                        <w:t xml:space="preserve"/>
+                      </w:r>
+                      <w:r>
+                        <w:rPr>
+                          <w:rFonts w:ascii="Zetta Serif Book" w:hAnsi="Zetta Serif Book"/>
+                          <w:color w:val="404040" w:themeColor="text1" w:themeTint="BF"/>
+                          <w:sz w:val="18"/>
+                          <w:szCs w:val="18"/>
+                        </w:rPr>
+                        <w:t/>
+                      </w:r>
+                    </w:p>
+                    <w:p>
+                      <w:pPr>
+                        <w:pStyle w:val="ListParagraph"/>
+                        <w:numPr>
+                          <w:ilvl w:val="0"/>
+                          <w:numId w:val="4"/>
+                        </w:numPr>
+                        <w:tabs>
+                          <w:tab w:val="left" w:pos="1080"/>
+                        </w:tabs>
+                        <w:spacing w:line="300" w:lineRule="auto"/>
+                        <w:rPr>
+                          <w:rFonts w:ascii="Zetta Serif Book" w:hAnsi="Zetta Serif Book"/>
+                          <w:color w:val="404040" w:themeColor="text1" w:themeTint="BF"/>
+                          <w:sz w:val="18"/>
+                          <w:szCs w:val="18"/>
+                        </w:rPr>
+                      </w:pPr>
+                      <w:r>
+                        <w:rPr>
+                          <w:rFonts w:ascii="Zetta Serif Book" w:hAnsi="Zetta Serif Book"/>
+                          <w:b/>
+                          <w:color w:val="404040" w:themeColor="text1" w:themeTint="BF"/>
+                          <w:sz w:val="18"/>
+                          <w:szCs w:val="18"/>
+                        </w:rPr>
+                        <w:t>Notes:</w:t>
+                      </w:r>
+                      <w:r>
+                        <w:rPr>
+                          <w:rFonts w:ascii="Zetta Serif Book" w:hAnsi="Zetta Serif Book"/>
+                          <w:color w:val="404040" w:themeColor="text1" w:themeTint="BF"/>
+                          <w:sz w:val="18"/>
+                          <w:szCs w:val="18"/>
+                        </w:rPr>
+                        <w:t xml:space="preserve">  {{work_notes}}</w:t>
                       </w:r>
                       <w:r>
                         <w:rPr>

</xml_diff>

<commit_message>
prod: promote combo WORK "Notes:" line (#137)
Promotes the combo template's new WORK "Notes: {{work_notes}}" line + its test
updates from staging (PR #137). Follows the established prod-promotion boundary:
only these 4 promotable files (combo template + 3 test files) change; the
Customer Portal admin + recipients frontend stay held at main's version.

Co-Authored-By: Claude Opus 4.8 (1M context) <noreply@anthropic.com>
</commit_message>
<xml_diff>
--- a/backend/templates/Direct/xx.xx.xx TREADWELL COMBO PROPOSAL - CUSTMOER NAME.docx
+++ b/backend/templates/Direct/xx.xx.xx TREADWELL COMBO PROPOSAL - CUSTMOER NAME.docx
@@ -1292,6 +1292,89 @@
                           </w:p>
                           <w:p>
                             <w:pPr>
+                              <w:pStyle w:val="ListParagraph"/>
+                              <w:numPr>
+                                <w:ilvl w:val="0"/>
+                                <w:numId w:val="4"/>
+                              </w:numPr>
+                              <w:tabs>
+                                <w:tab w:val="left" w:pos="1080"/>
+                              </w:tabs>
+                              <w:spacing w:line="300" w:lineRule="auto"/>
+                              <w:rPr>
+                                <w:rFonts w:ascii="Zetta Serif Book" w:hAnsi="Zetta Serif Book"/>
+                                <w:color w:val="404040" w:themeColor="text1" w:themeTint="BF"/>
+                                <w:sz w:val="18"/>
+                                <w:szCs w:val="18"/>
+                              </w:rPr>
+                            </w:pPr>
+                            <w:r>
+                              <w:rPr>
+                                <w:rFonts w:ascii="Zetta Serif Book" w:hAnsi="Zetta Serif Book"/>
+                                <w:b/>
+                                <w:color w:val="404040" w:themeColor="text1" w:themeTint="BF"/>
+                                <w:sz w:val="18"/>
+                                <w:szCs w:val="18"/>
+                              </w:rPr>
+                              <w:t>Notes:</w:t>
+                            </w:r>
+                            <w:r>
+                              <w:rPr>
+                                <w:rFonts w:ascii="Zetta Serif Book" w:hAnsi="Zetta Serif Book"/>
+                                <w:color w:val="404040" w:themeColor="text1" w:themeTint="BF"/>
+                                <w:sz w:val="18"/>
+                                <w:szCs w:val="18"/>
+                              </w:rPr>
+                              <w:t xml:space="preserve">  {{work_notes}}</w:t>
+                            </w:r>
+                            <w:r>
+                              <w:rPr>
+                                <w:rFonts w:ascii="Zetta Serif Book" w:hAnsi="Zetta Serif Book"/>
+                                <w:color w:val="404040" w:themeColor="text1" w:themeTint="BF"/>
+                                <w:sz w:val="18"/>
+                                <w:szCs w:val="18"/>
+                              </w:rPr>
+                              <w:t xml:space="preserve"/>
+                            </w:r>
+                            <w:r>
+                              <w:rPr>
+                                <w:rFonts w:ascii="Zetta Serif Book" w:hAnsi="Zetta Serif Book"/>
+                                <w:color w:val="404040" w:themeColor="text1" w:themeTint="BF"/>
+                                <w:sz w:val="18"/>
+                                <w:szCs w:val="18"/>
+                              </w:rPr>
+                              <w:t/>
+                            </w:r>
+                            <w:r>
+                              <w:rPr>
+                                <w:rFonts w:ascii="Zetta Serif Book" w:hAnsi="Zetta Serif Book"/>
+                                <w:color w:val="404040" w:themeColor="text1" w:themeTint="BF"/>
+                                <w:sz w:val="16"/>
+                                <w:szCs w:val="16"/>
+                              </w:rPr>
+                              <w:t/>
+                            </w:r>
+                            <w:r>
+                              <w:rPr>
+                                <w:rFonts w:ascii="Zetta Serif Book" w:hAnsi="Zetta Serif Book"/>
+                                <w:color w:val="404040" w:themeColor="text1" w:themeTint="BF"/>
+                                <w:sz w:val="16"/>
+                                <w:szCs w:val="16"/>
+                              </w:rPr>
+                              <w:t xml:space="preserve"/>
+                            </w:r>
+                            <w:r>
+                              <w:rPr>
+                                <w:rFonts w:ascii="Zetta Serif Book" w:hAnsi="Zetta Serif Book"/>
+                                <w:color w:val="404040" w:themeColor="text1" w:themeTint="BF"/>
+                                <w:sz w:val="18"/>
+                                <w:szCs w:val="18"/>
+                              </w:rPr>
+                              <w:t/>
+                            </w:r>
+                          </w:p>
+                          <w:p>
+                            <w:pPr>
                               <w:tabs>
                                 <w:tab w:val="left" w:pos="1080"/>
                               </w:tabs>
@@ -1785,6 +1868,89 @@
                           <w:szCs w:val="18"/>
                         </w:rPr>
                         <w:t xml:space="preserve">  {{exclusions}}</w:t>
+                      </w:r>
+                      <w:r>
+                        <w:rPr>
+                          <w:rFonts w:ascii="Zetta Serif Book" w:hAnsi="Zetta Serif Book"/>
+                          <w:color w:val="404040" w:themeColor="text1" w:themeTint="BF"/>
+                          <w:sz w:val="18"/>
+                          <w:szCs w:val="18"/>
+                        </w:rPr>
+                        <w:t xml:space="preserve"/>
+                      </w:r>
+                      <w:r>
+                        <w:rPr>
+                          <w:rFonts w:ascii="Zetta Serif Book" w:hAnsi="Zetta Serif Book"/>
+                          <w:color w:val="404040" w:themeColor="text1" w:themeTint="BF"/>
+                          <w:sz w:val="18"/>
+                          <w:szCs w:val="18"/>
+                        </w:rPr>
+                        <w:t/>
+                      </w:r>
+                      <w:r>
+                        <w:rPr>
+                          <w:rFonts w:ascii="Zetta Serif Book" w:hAnsi="Zetta Serif Book"/>
+                          <w:color w:val="404040" w:themeColor="text1" w:themeTint="BF"/>
+                          <w:sz w:val="16"/>
+                          <w:szCs w:val="16"/>
+                        </w:rPr>
+                        <w:t/>
+                      </w:r>
+                      <w:r>
+                        <w:rPr>
+                          <w:rFonts w:ascii="Zetta Serif Book" w:hAnsi="Zetta Serif Book"/>
+                          <w:color w:val="404040" w:themeColor="text1" w:themeTint="BF"/>
+                          <w:sz w:val="16"/>
+                          <w:szCs w:val="16"/>
+                        </w:rPr>
+                        <w:t xml:space="preserve"/>
+                      </w:r>
+                      <w:r>
+                        <w:rPr>
+                          <w:rFonts w:ascii="Zetta Serif Book" w:hAnsi="Zetta Serif Book"/>
+                          <w:color w:val="404040" w:themeColor="text1" w:themeTint="BF"/>
+                          <w:sz w:val="18"/>
+                          <w:szCs w:val="18"/>
+                        </w:rPr>
+                        <w:t/>
+                      </w:r>
+                    </w:p>
+                    <w:p>
+                      <w:pPr>
+                        <w:pStyle w:val="ListParagraph"/>
+                        <w:numPr>
+                          <w:ilvl w:val="0"/>
+                          <w:numId w:val="4"/>
+                        </w:numPr>
+                        <w:tabs>
+                          <w:tab w:val="left" w:pos="1080"/>
+                        </w:tabs>
+                        <w:spacing w:line="300" w:lineRule="auto"/>
+                        <w:rPr>
+                          <w:rFonts w:ascii="Zetta Serif Book" w:hAnsi="Zetta Serif Book"/>
+                          <w:color w:val="404040" w:themeColor="text1" w:themeTint="BF"/>
+                          <w:sz w:val="18"/>
+                          <w:szCs w:val="18"/>
+                        </w:rPr>
+                      </w:pPr>
+                      <w:r>
+                        <w:rPr>
+                          <w:rFonts w:ascii="Zetta Serif Book" w:hAnsi="Zetta Serif Book"/>
+                          <w:b/>
+                          <w:color w:val="404040" w:themeColor="text1" w:themeTint="BF"/>
+                          <w:sz w:val="18"/>
+                          <w:szCs w:val="18"/>
+                        </w:rPr>
+                        <w:t>Notes:</w:t>
+                      </w:r>
+                      <w:r>
+                        <w:rPr>
+                          <w:rFonts w:ascii="Zetta Serif Book" w:hAnsi="Zetta Serif Book"/>
+                          <w:color w:val="404040" w:themeColor="text1" w:themeTint="BF"/>
+                          <w:sz w:val="18"/>
+                          <w:szCs w:val="18"/>
+                        </w:rPr>
+                        <w:t xml:space="preserve">  {{work_notes}}</w:t>
                       </w:r>
                       <w:r>
                         <w:rPr>

</xml_diff>

<commit_message>
prod: promote combo WORK "Notes:" line (#137) (#138)
Promotes the combo template's new WORK "Notes: {{work_notes}}" line + its test
updates from staging (PR #137). Follows the established prod-promotion boundary:
only these 4 promotable files (combo template + 3 test files) change; the
Customer Portal admin + recipients frontend stay held at main's version.

Co-authored-by: internz2026-sys <internz.2026@gmail.com>
Co-authored-by: Claude Opus 4.8 (1M context) <noreply@anthropic.com>
</commit_message>
<xml_diff>
--- a/backend/templates/Direct/xx.xx.xx TREADWELL COMBO PROPOSAL - CUSTMOER NAME.docx
+++ b/backend/templates/Direct/xx.xx.xx TREADWELL COMBO PROPOSAL - CUSTMOER NAME.docx
@@ -1292,6 +1292,89 @@
                           </w:p>
                           <w:p>
                             <w:pPr>
+                              <w:pStyle w:val="ListParagraph"/>
+                              <w:numPr>
+                                <w:ilvl w:val="0"/>
+                                <w:numId w:val="4"/>
+                              </w:numPr>
+                              <w:tabs>
+                                <w:tab w:val="left" w:pos="1080"/>
+                              </w:tabs>
+                              <w:spacing w:line="300" w:lineRule="auto"/>
+                              <w:rPr>
+                                <w:rFonts w:ascii="Zetta Serif Book" w:hAnsi="Zetta Serif Book"/>
+                                <w:color w:val="404040" w:themeColor="text1" w:themeTint="BF"/>
+                                <w:sz w:val="18"/>
+                                <w:szCs w:val="18"/>
+                              </w:rPr>
+                            </w:pPr>
+                            <w:r>
+                              <w:rPr>
+                                <w:rFonts w:ascii="Zetta Serif Book" w:hAnsi="Zetta Serif Book"/>
+                                <w:b/>
+                                <w:color w:val="404040" w:themeColor="text1" w:themeTint="BF"/>
+                                <w:sz w:val="18"/>
+                                <w:szCs w:val="18"/>
+                              </w:rPr>
+                              <w:t>Notes:</w:t>
+                            </w:r>
+                            <w:r>
+                              <w:rPr>
+                                <w:rFonts w:ascii="Zetta Serif Book" w:hAnsi="Zetta Serif Book"/>
+                                <w:color w:val="404040" w:themeColor="text1" w:themeTint="BF"/>
+                                <w:sz w:val="18"/>
+                                <w:szCs w:val="18"/>
+                              </w:rPr>
+                              <w:t xml:space="preserve">  {{work_notes}}</w:t>
+                            </w:r>
+                            <w:r>
+                              <w:rPr>
+                                <w:rFonts w:ascii="Zetta Serif Book" w:hAnsi="Zetta Serif Book"/>
+                                <w:color w:val="404040" w:themeColor="text1" w:themeTint="BF"/>
+                                <w:sz w:val="18"/>
+                                <w:szCs w:val="18"/>
+                              </w:rPr>
+                              <w:t xml:space="preserve"/>
+                            </w:r>
+                            <w:r>
+                              <w:rPr>
+                                <w:rFonts w:ascii="Zetta Serif Book" w:hAnsi="Zetta Serif Book"/>
+                                <w:color w:val="404040" w:themeColor="text1" w:themeTint="BF"/>
+                                <w:sz w:val="18"/>
+                                <w:szCs w:val="18"/>
+                              </w:rPr>
+                              <w:t/>
+                            </w:r>
+                            <w:r>
+                              <w:rPr>
+                                <w:rFonts w:ascii="Zetta Serif Book" w:hAnsi="Zetta Serif Book"/>
+                                <w:color w:val="404040" w:themeColor="text1" w:themeTint="BF"/>
+                                <w:sz w:val="16"/>
+                                <w:szCs w:val="16"/>
+                              </w:rPr>
+                              <w:t/>
+                            </w:r>
+                            <w:r>
+                              <w:rPr>
+                                <w:rFonts w:ascii="Zetta Serif Book" w:hAnsi="Zetta Serif Book"/>
+                                <w:color w:val="404040" w:themeColor="text1" w:themeTint="BF"/>
+                                <w:sz w:val="16"/>
+                                <w:szCs w:val="16"/>
+                              </w:rPr>
+                              <w:t xml:space="preserve"/>
+                            </w:r>
+                            <w:r>
+                              <w:rPr>
+                                <w:rFonts w:ascii="Zetta Serif Book" w:hAnsi="Zetta Serif Book"/>
+                                <w:color w:val="404040" w:themeColor="text1" w:themeTint="BF"/>
+                                <w:sz w:val="18"/>
+                                <w:szCs w:val="18"/>
+                              </w:rPr>
+                              <w:t/>
+                            </w:r>
+                          </w:p>
+                          <w:p>
+                            <w:pPr>
                               <w:tabs>
                                 <w:tab w:val="left" w:pos="1080"/>
                               </w:tabs>
@@ -1785,6 +1868,89 @@
                           <w:szCs w:val="18"/>
                         </w:rPr>
                         <w:t xml:space="preserve">  {{exclusions}}</w:t>
+                      </w:r>
+                      <w:r>
+                        <w:rPr>
+                          <w:rFonts w:ascii="Zetta Serif Book" w:hAnsi="Zetta Serif Book"/>
+                          <w:color w:val="404040" w:themeColor="text1" w:themeTint="BF"/>
+                          <w:sz w:val="18"/>
+                          <w:szCs w:val="18"/>
+                        </w:rPr>
+                        <w:t xml:space="preserve"/>
+                      </w:r>
+                      <w:r>
+                        <w:rPr>
+                          <w:rFonts w:ascii="Zetta Serif Book" w:hAnsi="Zetta Serif Book"/>
+                          <w:color w:val="404040" w:themeColor="text1" w:themeTint="BF"/>
+                          <w:sz w:val="18"/>
+                          <w:szCs w:val="18"/>
+                        </w:rPr>
+                        <w:t/>
+                      </w:r>
+                      <w:r>
+                        <w:rPr>
+                          <w:rFonts w:ascii="Zetta Serif Book" w:hAnsi="Zetta Serif Book"/>
+                          <w:color w:val="404040" w:themeColor="text1" w:themeTint="BF"/>
+                          <w:sz w:val="16"/>
+                          <w:szCs w:val="16"/>
+                        </w:rPr>
+                        <w:t/>
+                      </w:r>
+                      <w:r>
+                        <w:rPr>
+                          <w:rFonts w:ascii="Zetta Serif Book" w:hAnsi="Zetta Serif Book"/>
+                          <w:color w:val="404040" w:themeColor="text1" w:themeTint="BF"/>
+                          <w:sz w:val="16"/>
+                          <w:szCs w:val="16"/>
+                        </w:rPr>
+                        <w:t xml:space="preserve"/>
+                      </w:r>
+                      <w:r>
+                        <w:rPr>
+                          <w:rFonts w:ascii="Zetta Serif Book" w:hAnsi="Zetta Serif Book"/>
+                          <w:color w:val="404040" w:themeColor="text1" w:themeTint="BF"/>
+                          <w:sz w:val="18"/>
+                          <w:szCs w:val="18"/>
+                        </w:rPr>
+                        <w:t/>
+                      </w:r>
+                    </w:p>
+                    <w:p>
+                      <w:pPr>
+                        <w:pStyle w:val="ListParagraph"/>
+                        <w:numPr>
+                          <w:ilvl w:val="0"/>
+                          <w:numId w:val="4"/>
+                        </w:numPr>
+                        <w:tabs>
+                          <w:tab w:val="left" w:pos="1080"/>
+                        </w:tabs>
+                        <w:spacing w:line="300" w:lineRule="auto"/>
+                        <w:rPr>
+                          <w:rFonts w:ascii="Zetta Serif Book" w:hAnsi="Zetta Serif Book"/>
+                          <w:color w:val="404040" w:themeColor="text1" w:themeTint="BF"/>
+                          <w:sz w:val="18"/>
+                          <w:szCs w:val="18"/>
+                        </w:rPr>
+                      </w:pPr>
+                      <w:r>
+                        <w:rPr>
+                          <w:rFonts w:ascii="Zetta Serif Book" w:hAnsi="Zetta Serif Book"/>
+                          <w:b/>
+                          <w:color w:val="404040" w:themeColor="text1" w:themeTint="BF"/>
+                          <w:sz w:val="18"/>
+                          <w:szCs w:val="18"/>
+                        </w:rPr>
+                        <w:t>Notes:</w:t>
+                      </w:r>
+                      <w:r>
+                        <w:rPr>
+                          <w:rFonts w:ascii="Zetta Serif Book" w:hAnsi="Zetta Serif Book"/>
+                          <w:color w:val="404040" w:themeColor="text1" w:themeTint="BF"/>
+                          <w:sz w:val="18"/>
+                          <w:szCs w:val="18"/>
+                        </w:rPr>
+                        <w:t xml:space="preserve">  {{work_notes}}</w:t>
                       </w:r>
                       <w:r>
                         <w:rPr>

</xml_diff>